<commit_message>
Set issue name on AD AB6665 closure package
Add Issue Name row and use "TRM TRR Lack of Proactive Obsolescence
Governance" consistently.

Co-Authored-By: Claude Opus 5.5 <noreply@anthropic.com>
Claude-Session: https://claude.ai/code/session_01XzRZ2SAnHh47JV1auqx4DH
</commit_message>
<xml_diff>
--- a/BSI.IT.5.R4_TRR_Proactive_Obsolescence_Governance_AD_AB6665_Closure_Package.docx
+++ b/BSI.IT.5.R4_TRR_Proactive_Obsolescence_Governance_AD_AB6665_Closure_Package.docx
@@ -109,7 +109,7 @@
                 <w:sz w:val="20"/>
                 <w:szCs w:val="20"/>
               </w:rPr>
-              <w:t xml:space="preserve">Validation Memo – TRM TRR: Lack of Proactive Obsolescence Governance – AD AB6665</w:t>
+              <w:t xml:space="preserve">Validation Memo – TRM TRR Lack of Proactive Obsolescence Governance – AD AB6665</w:t>
             </w:r>
           </w:p>
         </w:tc>
@@ -377,7 +377,7 @@
                 <w:sz w:val="17"/>
                 <w:szCs w:val="17"/>
               </w:rPr>
-              <w:t xml:space="preserve">Action Driver Name:</w:t>
+              <w:t xml:space="preserve">Issue Name:</w:t>
             </w:r>
           </w:p>
         </w:tc>
@@ -407,7 +407,7 @@
                 <w:sz w:val="17"/>
                 <w:szCs w:val="17"/>
               </w:rPr>
-              <w:t xml:space="preserve">TRM TRR: Lack of Proactive Obsolescence Governance</w:t>
+              <w:t xml:space="preserve">TRM TRR Lack of Proactive Obsolescence Governance</w:t>
             </w:r>
           </w:p>
         </w:tc>
@@ -442,6 +442,71 @@
                 <w:sz w:val="17"/>
                 <w:szCs w:val="17"/>
               </w:rPr>
+              <w:t xml:space="preserve">Action Driver Name:</w:t>
+            </w:r>
+          </w:p>
+        </w:tc>
+        <w:tc>
+          <w:tcPr>
+            <w:tcW w:type="dxa" w:w="9120"/>
+            <w:tcBorders>
+              <w:top w:val="single" w:color="BFBFBF" w:sz="4"/>
+              <w:left w:val="single" w:color="BFBFBF" w:sz="4"/>
+              <w:bottom w:val="single" w:color="BFBFBF" w:sz="4"/>
+              <w:right w:val="single" w:color="BFBFBF" w:sz="4"/>
+            </w:tcBorders>
+            <w:tcMar>
+              <w:top w:type="dxa" w:w="50"/>
+              <w:left w:type="dxa" w:w="100"/>
+              <w:bottom w:type="dxa" w:w="50"/>
+              <w:right w:type="dxa" w:w="100"/>
+            </w:tcMar>
+          </w:tcPr>
+          <w:p>
+            <w:pPr>
+              <w:spacing w:after="60" w:before="0"/>
+            </w:pPr>
+            <w:r>
+              <w:rPr>
+                <w:rFonts w:ascii="Calibri" w:cs="Calibri" w:eastAsia="Calibri" w:hAnsi="Calibri"/>
+                <w:sz w:val="17"/>
+                <w:szCs w:val="17"/>
+              </w:rPr>
+              <w:t xml:space="preserve">TRM TRR Lack of Proactive Obsolescence Governance</w:t>
+            </w:r>
+          </w:p>
+        </w:tc>
+      </w:tr>
+      <w:tr>
+        <w:tc>
+          <w:tcPr>
+            <w:tcW w:type="dxa" w:w="2400"/>
+            <w:tcBorders>
+              <w:top w:val="single" w:color="BFBFBF" w:sz="4"/>
+              <w:left w:val="single" w:color="BFBFBF" w:sz="4"/>
+              <w:bottom w:val="single" w:color="BFBFBF" w:sz="4"/>
+              <w:right w:val="single" w:color="BFBFBF" w:sz="4"/>
+            </w:tcBorders>
+            <w:shd w:fill="F2F2F2" w:color="auto" w:val="clear"/>
+            <w:tcMar>
+              <w:top w:type="dxa" w:w="50"/>
+              <w:left w:type="dxa" w:w="100"/>
+              <w:bottom w:type="dxa" w:w="50"/>
+              <w:right w:type="dxa" w:w="100"/>
+            </w:tcMar>
+          </w:tcPr>
+          <w:p>
+            <w:pPr>
+              <w:spacing w:after="0" w:before="0"/>
+            </w:pPr>
+            <w:r>
+              <w:rPr>
+                <w:rFonts w:ascii="Calibri" w:cs="Calibri" w:eastAsia="Calibri" w:hAnsi="Calibri"/>
+                <w:b/>
+                <w:bCs/>
+                <w:sz w:val="17"/>
+                <w:szCs w:val="17"/>
+              </w:rPr>
               <w:t xml:space="preserve">Issue Source:</w:t>
             </w:r>
           </w:p>
@@ -1020,7 +1085,7 @@
                 <w:sz w:val="17"/>
                 <w:szCs w:val="17"/>
               </w:rPr>
-              <w:t xml:space="preserve">IT RCSA performed validation testing to support closure of Action Driver 005056BCB79A1FD08FFEE8D5ABAB6665 (AB6665) – TRM TRR: Lack of Proactive Obsolescence Governance. The TRM Technology Risk Review found that BSI IT lacked proactive governance of technology obsolescence; the Action Driver required BSI IT to move from reactive remediation of obsolete assets to a governed, forward-looking process: a formal governance forum, an 18–24 month forward view of end-of-life (EOL) exposure, per-asset remediation tracking, funding traceability and a defined escalation path.</w:t>
+              <w:t xml:space="preserve">IT RCSA performed validation testing to support closure of Action Driver 005056BCB79A1FD08FFEE8D5ABAB6665 (AB6665) – TRM TRR Lack of Proactive Obsolescence Governance. The TRM Technology Risk Review found that BSI IT lacked proactive governance of technology obsolescence; the Action Driver required BSI IT to move from reactive remediation of obsolete assets to a governed, forward-looking process: a formal governance forum, an 18–24 month forward view of end-of-life (EOL) exposure, per-asset remediation tracking, funding traceability and a defined escalation path.</w:t>
             </w:r>
           </w:p>
           <w:p>
@@ -1111,7 +1176,7 @@
                 <w:sz w:val="17"/>
                 <w:szCs w:val="17"/>
               </w:rPr>
-              <w:t xml:space="preserve">Issue (TRM TRR – Lack of Proactive Obsolescence Governance): BSI IT did not govern technology obsolescence proactively. Assets reached vendor end of life without a forward view, committed remediation dates or funding visibility, and dependencies on InfoSec, application owners and vendors were not consistently escalated. This contributed to sustained KRI breaches, notably CI23514 – Percentage of obsolete database instances.</w:t>
+              <w:t xml:space="preserve">Issue: BSI IT did not govern technology obsolescence proactively. Assets reached vendor end of life without a forward view, committed remediation dates or funding visibility, and dependencies on InfoSec, application owners and vendors were not consistently escalated. This contributed to sustained KRI breaches, notably CI23514 – Percentage of obsolete database instances.</w:t>
             </w:r>
           </w:p>
           <w:p>
@@ -8710,7 +8775,7 @@
                 <w:sz w:val="17"/>
                 <w:szCs w:val="17"/>
               </w:rPr>
-              <w:t xml:space="preserve">IT RCSA reviewed Action Driver 005056BCB79A1FD08FFEE8D5ABAB6665 (AB6665) – TRM TRR: Lack of Proactive Obsolescence Governance – including the IT Obsolescence Management materials presented to the BSI IT Working Group for the July and August 2026 reporting cycles and the 9/30/2026 KRISP evidence. Testing confirmed that obsolescence is reviewed monthly in a formal forum with minutes, owners and dates; that a 24-month forward EOL view is rebuilt each cycle from KRISP asset-level dates; that planned assets are tracked in a per-asset register and allocated to a dated remediation roadmap with the funding position stated; and that breaches and dependencies are escalated and reported each cycle. The process produced measurable improvement – obsolete software assets fell from 35 to 20 and CI23514 returned from Red to Green. Based on the test results the control performance is rated Satisfactory, and Action Driver 005056BCB79A1FD08FFEE8D5ABAB6665 (AB6665) is considered Remediated, subject to resolution of the disclosures noted above.</w:t>
+              <w:t xml:space="preserve">IT RCSA reviewed Action Driver 005056BCB79A1FD08FFEE8D5ABAB6665 (AB6665) – TRM TRR Lack of Proactive Obsolescence Governance – including the IT Obsolescence Management materials presented to the BSI IT Working Group for the July and August 2026 reporting cycles and the 9/30/2026 KRISP evidence. Testing confirmed that obsolescence is reviewed monthly in a formal forum with minutes, owners and dates; that a 24-month forward EOL view is rebuilt each cycle from KRISP asset-level dates; that planned assets are tracked in a per-asset register and allocated to a dated remediation roadmap with the funding position stated; and that breaches and dependencies are escalated and reported each cycle. The process produced measurable improvement – obsolete software assets fell from 35 to 20 and CI23514 returned from Red to Green. Based on the test results the control performance is rated Satisfactory, and Action Driver 005056BCB79A1FD08FFEE8D5ABAB6665 (AB6665) is considered Remediated, subject to resolution of the disclosures noted above.</w:t>
             </w:r>
           </w:p>
         </w:tc>
@@ -9526,7 +9591,7 @@
         <w:sz w:val="14"/>
         <w:szCs w:val="14"/>
       </w:rPr>
-      <w:t xml:space="preserve">TRM TRR: Lack of Proactive Obsolescence Governance – AD 005056BCB79A1FD08FFEE8D5ABAB6665 – Closure Package  |  Page </w:t>
+      <w:t xml:space="preserve">TRM TRR Lack of Proactive Obsolescence Governance – AD 005056BCB79A1FD08FFEE8D5ABAB6665 – Closure Package  |  Page </w:t>
     </w:r>
     <w:r>
       <w:rPr>

</xml_diff>